<commit_message>
Configure Mẫu 5 template specifically to map guider details correctly and candidate details
</commit_message>
<xml_diff>
--- a/public/4. Mẫu 5. Bản nhận xét Đảng viên dự bị Chuyển SHĐ ĐVHD.docx
+++ b/public/4. Mẫu 5. Bản nhận xét Đảng viên dự bị Chuyển SHĐ ĐVHD.docx
@@ -156,15 +156,7 @@
           <w:bCs/>
           <w:sz w:val="28"/>
         </w:rPr>
-        <w:t>:  - Đảng ủy</w:t>
-      </w:r>
-      <w:r>
-        <w:rPr>
-          <w:rFonts w:eastAsia="Times New Roman" w:cs="Times New Roman"/>
-          <w:bCs/>
-          <w:sz w:val="28"/>
-        </w:rPr>
-        <w:t xml:space="preserve"> Trường Đại học Kinh tế</w:t>
+        <w:t>:  - Đảng ủy Trường Đại học Kinh tế</w:t>
       </w:r>
     </w:p>
     <w:p>
@@ -183,11 +175,6 @@
           <w:bCs/>
         </w:rPr>
         <w:tab/>
-      </w:r>
-      <w:r>
-        <w:rPr>
-          <w:bCs/>
-        </w:rPr>
         <w:t xml:space="preserve">                                                      </w:t>
       </w:r>
       <w:r>
@@ -208,15 +195,7 @@
           <w:bCs/>
           <w:sz w:val="28"/>
         </w:rPr>
-        <w:t>- Chi bô ̣</w:t>
-      </w:r>
-      <w:r>
-        <w:rPr>
-          <w:rFonts w:eastAsia="Times New Roman" w:cs="Times New Roman"/>
-          <w:bCs/>
-          <w:sz w:val="28"/>
-        </w:rPr>
-        <w:t>Sinh viên</w:t>
+        <w:t>- Chi bô ̣Sinh viên</w:t>
       </w:r>
     </w:p>
     <w:p>
@@ -232,224 +211,219 @@
         <w:t xml:space="preserve"> </w:t>
       </w:r>
     </w:p>
-    <w:p>
-      <w:pPr>
-        <w:spacing w:before="120" w:after="120" w:line="360" w:lineRule="atLeast"/>
-        <w:ind w:left="-5" w:hanging="10"/>
-        <w:jc w:val="both"/>
-        <w:rPr>
-          <w:sz w:val="28"/>
-          <w:szCs w:val="28"/>
-        </w:rPr>
-      </w:pPr>
-      <w:r>
-        <w:rPr>
-          <w:rFonts w:eastAsia="Times New Roman" w:cs="Times New Roman"/>
-          <w:sz w:val="28"/>
-          <w:szCs w:val="28"/>
-        </w:rPr>
-        <w:t xml:space="preserve">Tôi là: </w:t>
-      </w:r>
-      <w:r>
-        <w:rPr>
-          <w:rFonts w:eastAsia="Times New Roman" w:cs="Times New Roman"/>
-          <w:sz w:val="28"/>
-          <w:szCs w:val="28"/>
-        </w:rPr>
-        <w:t>Lê Vĩnh Diện</w:t>
-      </w:r>
-      <w:r>
-        <w:rPr>
-          <w:rFonts w:eastAsia="Times New Roman" w:cs="Times New Roman"/>
-          <w:sz w:val="28"/>
-          <w:szCs w:val="28"/>
-        </w:rPr>
-        <w:tab/>
-      </w:r>
-      <w:r>
-        <w:rPr>
-          <w:rFonts w:eastAsia="Times New Roman" w:cs="Times New Roman"/>
-          <w:sz w:val="28"/>
-          <w:szCs w:val="28"/>
-        </w:rPr>
-        <w:tab/>
-      </w:r>
-      <w:r>
-        <w:rPr>
-          <w:rFonts w:eastAsia="Times New Roman" w:cs="Times New Roman"/>
-          <w:sz w:val="28"/>
-          <w:szCs w:val="28"/>
-        </w:rPr>
-        <w:tab/>
-      </w:r>
-      <w:r>
-        <w:rPr>
-          <w:rFonts w:eastAsia="Times New Roman" w:cs="Times New Roman"/>
-          <w:sz w:val="28"/>
-          <w:szCs w:val="28"/>
-        </w:rPr>
-        <w:t xml:space="preserve">Sinh ngày </w:t>
-      </w:r>
-      <w:r>
-        <w:rPr>
-          <w:rFonts w:eastAsia="Times New Roman" w:cs="Times New Roman"/>
-          <w:sz w:val="28"/>
-          <w:szCs w:val="28"/>
-        </w:rPr>
-        <w:t xml:space="preserve">01 </w:t>
-      </w:r>
-      <w:r>
-        <w:rPr>
-          <w:rFonts w:eastAsia="Times New Roman" w:cs="Times New Roman"/>
-          <w:sz w:val="28"/>
-          <w:szCs w:val="28"/>
-        </w:rPr>
-        <w:t>tháng</w:t>
-      </w:r>
-      <w:r>
-        <w:rPr>
-          <w:rFonts w:eastAsia="Times New Roman" w:cs="Times New Roman"/>
-          <w:sz w:val="28"/>
-          <w:szCs w:val="28"/>
-        </w:rPr>
-        <w:t xml:space="preserve"> 04</w:t>
-      </w:r>
-      <w:r>
-        <w:rPr>
-          <w:rFonts w:eastAsia="Times New Roman" w:cs="Times New Roman"/>
-          <w:sz w:val="28"/>
-          <w:szCs w:val="28"/>
-        </w:rPr>
-        <w:t xml:space="preserve"> năm</w:t>
-      </w:r>
-      <w:r>
-        <w:rPr>
-          <w:rFonts w:eastAsia="Times New Roman" w:cs="Times New Roman"/>
-          <w:sz w:val="28"/>
-          <w:szCs w:val="28"/>
-        </w:rPr>
-        <w:t xml:space="preserve"> 2004</w:t>
-      </w:r>
-      <w:r>
-        <w:rPr>
-          <w:rFonts w:eastAsia="Times New Roman" w:cs="Times New Roman"/>
-          <w:sz w:val="28"/>
-          <w:szCs w:val="28"/>
-        </w:rPr>
-        <w:t xml:space="preserve"> </w:t>
-      </w:r>
-    </w:p>
-    <w:p>
-      <w:pPr>
-        <w:spacing w:before="120" w:after="120" w:line="360" w:lineRule="atLeast"/>
-        <w:ind w:left="-5" w:hanging="10"/>
-        <w:jc w:val="both"/>
-        <w:rPr>
-          <w:rFonts w:eastAsia="Times New Roman" w:cs="Times New Roman"/>
-          <w:sz w:val="28"/>
-          <w:szCs w:val="28"/>
-        </w:rPr>
-      </w:pPr>
-      <w:r>
-        <w:rPr>
-          <w:rFonts w:eastAsia="Times New Roman" w:cs="Times New Roman"/>
-          <w:sz w:val="28"/>
-          <w:szCs w:val="28"/>
-        </w:rPr>
-        <w:t xml:space="preserve">Ngày </w:t>
-      </w:r>
-      <w:r>
-        <w:rPr>
-          <w:rFonts w:eastAsia="Times New Roman" w:cs="Times New Roman"/>
-          <w:sz w:val="28"/>
-          <w:szCs w:val="28"/>
-        </w:rPr>
-        <w:t>v</w:t>
-      </w:r>
-      <w:r>
-        <w:rPr>
-          <w:rFonts w:eastAsia="Times New Roman" w:cs="Times New Roman"/>
-          <w:sz w:val="28"/>
-          <w:szCs w:val="28"/>
-        </w:rPr>
-        <w:t>ào Đảng</w:t>
-      </w:r>
-      <w:r>
-        <w:rPr>
-          <w:rFonts w:eastAsia="Times New Roman" w:cs="Times New Roman"/>
-          <w:sz w:val="28"/>
-          <w:szCs w:val="28"/>
-        </w:rPr>
-        <w:t>: 26/07/2022</w:t>
-      </w:r>
-      <w:r>
-        <w:rPr>
-          <w:rFonts w:eastAsia="Times New Roman" w:cs="Times New Roman"/>
-          <w:sz w:val="28"/>
-          <w:szCs w:val="28"/>
-        </w:rPr>
-        <w:tab/>
-      </w:r>
-      <w:r>
-        <w:rPr>
-          <w:rFonts w:eastAsia="Times New Roman" w:cs="Times New Roman"/>
-          <w:sz w:val="28"/>
-          <w:szCs w:val="28"/>
-        </w:rPr>
-        <w:tab/>
-      </w:r>
-      <w:r>
-        <w:rPr>
-          <w:rFonts w:eastAsia="Times New Roman" w:cs="Times New Roman"/>
-          <w:sz w:val="28"/>
-          <w:szCs w:val="28"/>
-        </w:rPr>
-        <w:t>Chính thức</w:t>
-      </w:r>
-      <w:r>
-        <w:rPr>
-          <w:rFonts w:eastAsia="Times New Roman" w:cs="Times New Roman"/>
-          <w:sz w:val="28"/>
-          <w:szCs w:val="28"/>
-        </w:rPr>
-        <w:t>: 26/07/2023</w:t>
-      </w:r>
-    </w:p>
-    <w:p>
-      <w:pPr>
-        <w:spacing w:before="120" w:after="120" w:line="360" w:lineRule="atLeast"/>
-        <w:ind w:left="-5" w:hanging="10"/>
-        <w:jc w:val="both"/>
-        <w:rPr>
-          <w:sz w:val="28"/>
-          <w:szCs w:val="28"/>
-        </w:rPr>
-      </w:pPr>
-      <w:r>
-        <w:rPr>
-          <w:rFonts w:eastAsia="Times New Roman" w:cs="Times New Roman"/>
-          <w:sz w:val="28"/>
-          <w:szCs w:val="28"/>
-        </w:rPr>
-        <w:t>Hiện đ</w:t>
-      </w:r>
-      <w:r>
-        <w:rPr>
-          <w:rFonts w:eastAsia="Times New Roman" w:cs="Times New Roman"/>
-          <w:sz w:val="28"/>
-          <w:szCs w:val="28"/>
-        </w:rPr>
-        <w:t xml:space="preserve">ang sinh hoạt tại Chi bộ </w:t>
-      </w:r>
-      <w:r>
-        <w:rPr>
-          <w:rFonts w:eastAsia="Times New Roman" w:cs="Times New Roman"/>
-          <w:sz w:val="28"/>
-          <w:szCs w:val="28"/>
-        </w:rPr>
-        <w:t>Sinh viên</w:t>
-      </w:r>
-    </w:p>
+    <w:tbl>
+      <w:tblPr>
+        <w:tblStyle w:val="TableGrid"/>
+        <w:tblW w:w="0" w:type="auto"/>
+        <w:tblBorders>
+          <w:top w:val="none" w:sz="0" w:space="0" w:color="auto"/>
+          <w:left w:val="none" w:sz="0" w:space="0" w:color="auto"/>
+          <w:bottom w:val="none" w:sz="0" w:space="0" w:color="auto"/>
+          <w:right w:val="none" w:sz="0" w:space="0" w:color="auto"/>
+          <w:insideH w:val="none" w:sz="0" w:space="0" w:color="auto"/>
+          <w:insideV w:val="none" w:sz="0" w:space="0" w:color="auto"/>
+        </w:tblBorders>
+        <w:tblLook w:val="04A0" w:firstRow="1" w:lastRow="0" w:firstColumn="1" w:lastColumn="0" w:noHBand="0" w:noVBand="1"/>
+      </w:tblPr>
+      <w:tblGrid>
+        <w:gridCol w:w="5382"/>
+        <w:gridCol w:w="3962"/>
+      </w:tblGrid>
+      <w:tr>
+        <w:trPr>
+          <w:trHeight w:val="283"/>
+        </w:trPr>
+        <w:tc>
+          <w:tcPr>
+            <w:tcW w:w="5382" w:type="dxa"/>
+          </w:tcPr>
+          <w:p>
+            <w:pPr>
+              <w:spacing w:line="400" w:lineRule="atLeast"/>
+              <w:ind w:left="-5" w:hanging="10"/>
+              <w:jc w:val="both"/>
+              <w:rPr>
+                <w:sz w:val="28"/>
+                <w:szCs w:val="28"/>
+              </w:rPr>
+            </w:pPr>
+            <w:r>
+              <w:rPr>
+                <w:rFonts w:eastAsia="Times New Roman" w:cs="Times New Roman"/>
+                <w:sz w:val="28"/>
+                <w:szCs w:val="28"/>
+              </w:rPr>
+              <w:t>Tôi là: Lê Vĩnh Diện</w:t>
+            </w:r>
+            <w:r>
+              <w:rPr>
+                <w:rFonts w:eastAsia="Times New Roman" w:cs="Times New Roman"/>
+                <w:sz w:val="28"/>
+                <w:szCs w:val="28"/>
+              </w:rPr>
+              <w:tab/>
+            </w:r>
+            <w:r>
+              <w:rPr>
+                <w:rFonts w:eastAsia="Times New Roman" w:cs="Times New Roman"/>
+                <w:sz w:val="28"/>
+                <w:szCs w:val="28"/>
+              </w:rPr>
+              <w:tab/>
+            </w:r>
+            <w:bookmarkStart w:id="0" w:name="_Hlk231488799"/>
+            <w:r>
+              <w:rPr>
+                <w:rFonts w:eastAsia="Times New Roman" w:cs="Times New Roman"/>
+                <w:sz w:val="28"/>
+                <w:szCs w:val="28"/>
+              </w:rPr>
+              <w:t xml:space="preserve"> </w:t>
+            </w:r>
+            <w:bookmarkEnd w:id="0"/>
+          </w:p>
+        </w:tc>
+        <w:tc>
+          <w:tcPr>
+            <w:tcW w:w="3962" w:type="dxa"/>
+          </w:tcPr>
+          <w:p>
+            <w:pPr>
+              <w:spacing w:line="360" w:lineRule="atLeast"/>
+              <w:ind w:right="86"/>
+              <w:jc w:val="both"/>
+              <w:rPr>
+                <w:rFonts w:eastAsia="Times New Roman" w:cs="Times New Roman"/>
+                <w:sz w:val="28"/>
+                <w:szCs w:val="28"/>
+              </w:rPr>
+            </w:pPr>
+            <w:r>
+              <w:rPr>
+                <w:rFonts w:eastAsia="Times New Roman" w:cs="Times New Roman"/>
+                <w:sz w:val="28"/>
+                <w:szCs w:val="28"/>
+              </w:rPr>
+              <w:t>Ngày sinh: 01/04/2004</w:t>
+            </w:r>
+          </w:p>
+        </w:tc>
+      </w:tr>
+      <w:tr>
+        <w:trPr>
+          <w:trHeight w:val="283"/>
+        </w:trPr>
+        <w:tc>
+          <w:tcPr>
+            <w:tcW w:w="5382" w:type="dxa"/>
+          </w:tcPr>
+          <w:p>
+            <w:pPr>
+              <w:spacing w:line="400" w:lineRule="atLeast"/>
+              <w:ind w:right="86"/>
+              <w:jc w:val="both"/>
+              <w:rPr>
+                <w:rFonts w:eastAsia="Times New Roman" w:cs="Times New Roman"/>
+                <w:sz w:val="28"/>
+                <w:szCs w:val="28"/>
+              </w:rPr>
+            </w:pPr>
+            <w:r>
+              <w:rPr>
+                <w:rFonts w:eastAsia="Times New Roman" w:cs="Times New Roman"/>
+                <w:sz w:val="28"/>
+                <w:szCs w:val="28"/>
+              </w:rPr>
+              <w:t xml:space="preserve">Ngày vào Đảng: </w:t>
+            </w:r>
+            <w:bookmarkStart w:id="1" w:name="_Hlk231488814"/>
+            <w:r>
+              <w:rPr>
+                <w:rFonts w:eastAsia="Times New Roman" w:cs="Times New Roman"/>
+                <w:sz w:val="28"/>
+                <w:szCs w:val="28"/>
+              </w:rPr>
+              <w:t>26/07/2022</w:t>
+            </w:r>
+            <w:bookmarkEnd w:id="1"/>
+          </w:p>
+        </w:tc>
+        <w:tc>
+          <w:tcPr>
+            <w:tcW w:w="3962" w:type="dxa"/>
+          </w:tcPr>
+          <w:p>
+            <w:pPr>
+              <w:spacing w:line="360" w:lineRule="atLeast"/>
+              <w:ind w:right="86"/>
+              <w:jc w:val="both"/>
+              <w:rPr>
+                <w:rFonts w:eastAsia="Times New Roman" w:cs="Times New Roman"/>
+                <w:sz w:val="28"/>
+                <w:szCs w:val="28"/>
+              </w:rPr>
+            </w:pPr>
+            <w:r>
+              <w:rPr>
+                <w:rFonts w:eastAsia="Times New Roman" w:cs="Times New Roman"/>
+                <w:sz w:val="28"/>
+                <w:szCs w:val="28"/>
+              </w:rPr>
+              <w:t>Ngày c</w:t>
+            </w:r>
+            <w:r>
+              <w:rPr>
+                <w:rFonts w:eastAsia="Times New Roman" w:cs="Times New Roman"/>
+                <w:sz w:val="28"/>
+                <w:szCs w:val="28"/>
+              </w:rPr>
+              <w:t xml:space="preserve">hính thức: </w:t>
+            </w:r>
+            <w:bookmarkStart w:id="2" w:name="_Hlk231488819"/>
+            <w:r>
+              <w:rPr>
+                <w:rFonts w:eastAsia="Times New Roman" w:cs="Times New Roman"/>
+                <w:sz w:val="28"/>
+                <w:szCs w:val="28"/>
+              </w:rPr>
+              <w:t>26/07/2023</w:t>
+            </w:r>
+            <w:bookmarkEnd w:id="2"/>
+          </w:p>
+        </w:tc>
+      </w:tr>
+      <w:tr>
+        <w:trPr>
+          <w:trHeight w:val="283"/>
+        </w:trPr>
+        <w:tc>
+          <w:tcPr>
+            <w:tcW w:w="9344" w:type="dxa"/>
+            <w:gridSpan w:val="2"/>
+          </w:tcPr>
+          <w:p>
+            <w:pPr>
+              <w:spacing w:line="400" w:lineRule="atLeast"/>
+              <w:ind w:right="86"/>
+              <w:jc w:val="both"/>
+              <w:rPr>
+                <w:rFonts w:eastAsia="Times New Roman" w:cs="Times New Roman"/>
+                <w:sz w:val="28"/>
+                <w:szCs w:val="28"/>
+              </w:rPr>
+            </w:pPr>
+            <w:r>
+              <w:rPr>
+                <w:rFonts w:eastAsia="Times New Roman" w:cs="Times New Roman"/>
+                <w:sz w:val="28"/>
+                <w:szCs w:val="28"/>
+              </w:rPr>
+              <w:t>Hiện đang sinh hoạt tại Chi bộ Sinh viên</w:t>
+            </w:r>
+          </w:p>
+        </w:tc>
+      </w:tr>
+    </w:tbl>
     <w:p>
       <w:pPr>
         <w:spacing w:before="120" w:after="120" w:line="360" w:lineRule="atLeast"/>
@@ -466,87 +440,25 @@
           <w:sz w:val="28"/>
           <w:szCs w:val="28"/>
         </w:rPr>
-        <w:t>Ngày</w:t>
+        <w:t xml:space="preserve">Ngày </w:t>
       </w:r>
+      <w:bookmarkStart w:id="3" w:name="_Hlk231488853"/>
       <w:r>
         <w:rPr>
           <w:rFonts w:eastAsia="Times New Roman" w:cs="Times New Roman"/>
           <w:sz w:val="28"/>
           <w:szCs w:val="28"/>
         </w:rPr>
-        <w:t xml:space="preserve"> 26 tháng 07 năm 2026 </w:t>
+        <w:t xml:space="preserve">26 tháng 07 năm 2026 </w:t>
       </w:r>
+      <w:bookmarkEnd w:id="3"/>
       <w:r>
         <w:rPr>
           <w:rFonts w:eastAsia="Times New Roman" w:cs="Times New Roman"/>
           <w:sz w:val="28"/>
           <w:szCs w:val="28"/>
         </w:rPr>
-        <w:t xml:space="preserve">được Chi bộ phân công giúp đỡ đảng viên dự bị: </w:t>
-      </w:r>
-      <w:r>
-        <w:rPr>
-          <w:rFonts w:eastAsia="Times New Roman" w:cs="Times New Roman"/>
-          <w:sz w:val="28"/>
-          <w:szCs w:val="28"/>
-        </w:rPr>
-        <w:t xml:space="preserve">Nguyễn Văn A </w:t>
-      </w:r>
-      <w:r>
-        <w:rPr>
-          <w:rFonts w:eastAsia="Times New Roman" w:cs="Times New Roman"/>
-          <w:sz w:val="28"/>
-          <w:szCs w:val="28"/>
-        </w:rPr>
-        <w:t xml:space="preserve">được kết nạp vào Đảng ngày </w:t>
-      </w:r>
-      <w:r>
-        <w:rPr>
-          <w:rFonts w:eastAsia="Times New Roman" w:cs="Times New Roman"/>
-          <w:sz w:val="28"/>
-          <w:szCs w:val="28"/>
-        </w:rPr>
-        <w:t xml:space="preserve">26 </w:t>
-      </w:r>
-      <w:r>
-        <w:rPr>
-          <w:rFonts w:eastAsia="Times New Roman" w:cs="Times New Roman"/>
-          <w:sz w:val="28"/>
-          <w:szCs w:val="28"/>
-        </w:rPr>
-        <w:t xml:space="preserve">tháng </w:t>
-      </w:r>
-      <w:r>
-        <w:rPr>
-          <w:rFonts w:eastAsia="Times New Roman" w:cs="Times New Roman"/>
-          <w:sz w:val="28"/>
-          <w:szCs w:val="28"/>
-        </w:rPr>
-        <w:t>5</w:t>
-      </w:r>
-      <w:r>
-        <w:rPr>
-          <w:rFonts w:eastAsia="Times New Roman" w:cs="Times New Roman"/>
-          <w:sz w:val="28"/>
-          <w:szCs w:val="28"/>
-        </w:rPr>
-        <w:t xml:space="preserve"> năm</w:t>
-      </w:r>
-      <w:r>
-        <w:rPr>
-          <w:rFonts w:eastAsia="Times New Roman" w:cs="Times New Roman"/>
-          <w:sz w:val="28"/>
-          <w:szCs w:val="28"/>
-        </w:rPr>
-        <w:t xml:space="preserve"> 2026</w:t>
-      </w:r>
-      <w:r>
-        <w:rPr>
-          <w:rFonts w:eastAsia="Times New Roman" w:cs="Times New Roman"/>
-          <w:sz w:val="28"/>
-          <w:szCs w:val="28"/>
-        </w:rPr>
-        <w:t>, nay xin báo cáo Đảng ủy và Chi bộ những vấn đề chủ yếu của đảng viên dự bị như sau:</w:t>
+        <w:t>được Chi bộ phân công giúp đỡ đảng viên dự bị: Nguyễn Văn A được kết nạp vào Đảng ngày 26 tháng 5 năm 2026, nay xin báo cáo Đảng ủy và Chi bộ những vấn đề chủ yếu của đảng viên dự bị như sau:</w:t>
       </w:r>
     </w:p>
     <w:p>
@@ -744,14 +656,6 @@
           <w:lang w:val="fr-BE"/>
         </w:rPr>
         <w:tab/>
-      </w:r>
-      <w:r>
-        <w:rPr>
-          <w:rFonts w:eastAsia="Times New Roman" w:cs="Times New Roman"/>
-          <w:sz w:val="28"/>
-          <w:szCs w:val="28"/>
-          <w:lang w:val="fr-BE"/>
-        </w:rPr>
         <w:t>Tôi xin chịu trách nhiệm trước Đảng về lời nhận xét của mình.</w:t>
       </w:r>
     </w:p>
@@ -1543,6 +1447,7 @@
   <w:style w:type="character" w:default="1" w:styleId="DefaultParagraphFont">
     <w:name w:val="Default Paragraph Font"/>
     <w:uiPriority w:val="1"/>
+    <w:semiHidden/>
     <w:unhideWhenUsed/>
   </w:style>
   <w:style w:type="table" w:default="1" w:styleId="TableNormal">

</xml_diff>